<commit_message>
feat: clickable links, bulleted experience, Carlito typography in CVs
</commit_message>
<xml_diff>
--- a/public/cv/CV-minimal.docx
+++ b/public/cv/CV-minimal.docx
@@ -22,11 +22,73 @@
       <w:pPr>
         <w:pStyle w:val="BodyText"/>
       </w:pPr>
-      <w:r>
-        <w:t xml:space="preserve">Mtsarac03@gmail.com  |  (541) 614-8690  |  linkedin.com/in/mtsarac  |  Github.com/mtsarac  |  msarac.me  |  Merkezefendi/Denizli</w:t>
-      </w:r>
-    </w:p>
-    <w:bookmarkStart w:id="9" w:name="profil"/>
+      <w:hyperlink r:id="rId9">
+        <w:r>
+          <w:rPr>
+            <w:rStyle w:val="Hyperlink"/>
+          </w:rPr>
+          <w:t xml:space="preserve">Mtsarac03@gmail.com</w:t>
+        </w:r>
+      </w:hyperlink>
+      <w:r>
+        <w:t xml:space="preserve"> </w:t>
+      </w:r>
+      <w:r>
+        <w:t xml:space="preserve"> |  (541) 614-8690  | </w:t>
+      </w:r>
+      <w:r>
+        <w:t xml:space="preserve"> </w:t>
+      </w:r>
+      <w:hyperlink r:id="rId10">
+        <w:r>
+          <w:rPr>
+            <w:rStyle w:val="Hyperlink"/>
+          </w:rPr>
+          <w:t xml:space="preserve">linkedin.com/in/mtsarac</w:t>
+        </w:r>
+      </w:hyperlink>
+      <w:r>
+        <w:t xml:space="preserve"> </w:t>
+      </w:r>
+      <w:r>
+        <w:t xml:space="preserve"> | </w:t>
+      </w:r>
+      <w:r>
+        <w:t xml:space="preserve"> </w:t>
+      </w:r>
+      <w:hyperlink r:id="rId11">
+        <w:r>
+          <w:rPr>
+            <w:rStyle w:val="Hyperlink"/>
+          </w:rPr>
+          <w:t xml:space="preserve">Github.com/mtsarac</w:t>
+        </w:r>
+      </w:hyperlink>
+      <w:r>
+        <w:t xml:space="preserve"> </w:t>
+      </w:r>
+      <w:r>
+        <w:t xml:space="preserve"> | </w:t>
+      </w:r>
+      <w:r>
+        <w:t xml:space="preserve"> </w:t>
+      </w:r>
+      <w:hyperlink r:id="rId12">
+        <w:r>
+          <w:rPr>
+            <w:rStyle w:val="Hyperlink"/>
+          </w:rPr>
+          <w:t xml:space="preserve">msarac.me</w:t>
+        </w:r>
+      </w:hyperlink>
+      <w:r>
+        <w:t xml:space="preserve"> </w:t>
+      </w:r>
+      <w:r>
+        <w:t xml:space="preserve"> |  Merkezefendi/Denizli</w:t>
+      </w:r>
+    </w:p>
+    <w:bookmarkStart w:id="13" w:name="profil"/>
     <w:p>
       <w:pPr>
         <w:pStyle w:val="Heading2"/>
@@ -43,8 +105,8 @@
         <w:t xml:space="preserve">Pamukkale Üniversitesi son sınıf Bilgisayar Mühendisliği öğrencisiyim (GPA 3.32). NestJS, PostgreSQL ve React ile backend ağırlıklı full-stack geliştirmeye odaklanıyorum. Gerçek ürün çıkaracağım junior ve staj pozisyonları arıyorum.</w:t>
       </w:r>
     </w:p>
-    <w:bookmarkEnd w:id="9"/>
-    <w:bookmarkStart w:id="10" w:name="deneyim"/>
+    <w:bookmarkEnd w:id="13"/>
+    <w:bookmarkStart w:id="14" w:name="deneyim"/>
     <w:p>
       <w:pPr>
         <w:pStyle w:val="Heading2"/>
@@ -62,117 +124,6 @@
       </w:r>
       <w:r>
         <w:t xml:space="preserve">Tem – Ağu 2026</w:t>
-      </w:r>
-    </w:p>
-    <w:p>
-      <w:pPr>
-        <w:pStyle w:val="BodyText"/>
-      </w:pPr>
-      <w:r>
-        <w:t xml:space="preserve">PostgreSQL envanter şeması; React + TypeScript CRM prototipi; SAP/Jira/Qlik süreçleri; MASSGuard AI konsepti.</w:t>
-      </w:r>
-    </w:p>
-    <w:p>
-      <w:pPr>
-        <w:pStyle w:val="BodyText"/>
-      </w:pPr>
-      <w:r>
-        <w:t xml:space="preserve">TNC Group / Social Office – BT Stajyeri</w:t>
-      </w:r>
-      <w:r>
-        <w:t xml:space="preserve">2026</w:t>
-      </w:r>
-    </w:p>
-    <w:p>
-      <w:pPr>
-        <w:pStyle w:val="BodyText"/>
-      </w:pPr>
-      <w:r>
-        <w:t xml:space="preserve">Python CLI, Excel dashboard, AutoCAD çizim, Blender 3D oda.</w:t>
-      </w:r>
-    </w:p>
-    <w:bookmarkEnd w:id="10"/>
-    <w:bookmarkStart w:id="11" w:name="projeler"/>
-    <w:p>
-      <w:pPr>
-        <w:pStyle w:val="Heading2"/>
-      </w:pPr>
-      <w:r>
-        <w:t xml:space="preserve">PROJELER</w:t>
-      </w:r>
-    </w:p>
-    <w:p>
-      <w:pPr>
-        <w:pStyle w:val="FirstParagraph"/>
-      </w:pPr>
-      <w:r>
-        <w:t xml:space="preserve">Adrenal Anomali Tespit Sistemi – Tez projesi</w:t>
-      </w:r>
-    </w:p>
-    <w:p>
-      <w:pPr>
-        <w:pStyle w:val="BodyText"/>
-      </w:pPr>
-      <w:r>
-        <w:t xml:space="preserve">Klinik karar destek için JWT’li NestJS + PostgreSQL backend ve React Native MRI/AI uygulaması. Özel, detaylar istek üzerine.</w:t>
-      </w:r>
-    </w:p>
-    <w:bookmarkEnd w:id="11"/>
-    <w:bookmarkStart w:id="12" w:name="eğitim"/>
-    <w:p>
-      <w:pPr>
-        <w:pStyle w:val="Heading2"/>
-      </w:pPr>
-      <w:r>
-        <w:t xml:space="preserve">EĞİTİM</w:t>
-      </w:r>
-    </w:p>
-    <w:p>
-      <w:pPr>
-        <w:pStyle w:val="FirstParagraph"/>
-      </w:pPr>
-      <w:r>
-        <w:t xml:space="preserve">Pamukkale Üniversitesi – Bilgisayar Mühendisliği Lisans</w:t>
-      </w:r>
-      <w:r>
-        <w:t xml:space="preserve">2022 – 2026 | GPA: 3.32</w:t>
-      </w:r>
-    </w:p>
-    <w:p>
-      <w:pPr>
-        <w:pStyle w:val="BodyText"/>
-      </w:pPr>
-      <w:r>
-        <w:t xml:space="preserve">Veri yapıları, algoritmalar, veritabanları, işletim sistemleri, yazılım mühendisliği, web teknolojileri, ağlar, makine öğrenmesi, yapay zeka, grafik, bulut bilişim.</w:t>
-      </w:r>
-    </w:p>
-    <w:p>
-      <w:pPr>
-        <w:pStyle w:val="BodyText"/>
-      </w:pPr>
-      <w:r>
-        <w:t xml:space="preserve">Maribor Üniversitesi – Erasmus</w:t>
-      </w:r>
-      <w:r>
-        <w:t xml:space="preserve">Şub – Tem 2025</w:t>
-      </w:r>
-    </w:p>
-    <w:p>
-      <w:pPr>
-        <w:pStyle w:val="BodyText"/>
-      </w:pPr>
-      <w:r>
-        <w:t xml:space="preserve">C++ ile OOP; Blender ile 3D animasyon ve grafik.</w:t>
-      </w:r>
-    </w:p>
-    <w:bookmarkEnd w:id="12"/>
-    <w:bookmarkStart w:id="13" w:name="yetenekler"/>
-    <w:p>
-      <w:pPr>
-        <w:pStyle w:val="Heading2"/>
-      </w:pPr>
-      <w:r>
-        <w:t xml:space="preserve">YETENEKLER</w:t>
       </w:r>
     </w:p>
     <w:p>
@@ -184,7 +135,7 @@
         </w:numPr>
       </w:pPr>
       <w:r>
-        <w:t xml:space="preserve">Java, C#, TypeScript, SQL, HTML, CSS</w:t>
+        <w:t xml:space="preserve">BT envanter, stok ve zimmet takibi için PostgreSQL şeması</w:t>
       </w:r>
     </w:p>
     <w:p>
@@ -196,7 +147,7 @@
         </w:numPr>
       </w:pPr>
       <w:r>
-        <w:t xml:space="preserve">React, Next.js, React Native, NestJS, REST API, .NET Web API, MS SQL Server, PostgreSQL, Expo</w:t>
+        <w:t xml:space="preserve">İş gereksinimlerinden React + TypeScript CRM prototipi</w:t>
       </w:r>
     </w:p>
     <w:p>
@@ -208,10 +159,165 @@
         </w:numPr>
       </w:pPr>
       <w:r>
+        <w:t xml:space="preserve">SAP, Jira ve Qlik süreçleri; MASSGuard AI konsepti</w:t>
+      </w:r>
+    </w:p>
+    <w:p>
+      <w:pPr>
+        <w:pStyle w:val="FirstParagraph"/>
+      </w:pPr>
+      <w:r>
+        <w:t xml:space="preserve">TNC Group / Social Office – BT Stajyeri</w:t>
+      </w:r>
+      <w:r>
+        <w:t xml:space="preserve">2026</w:t>
+      </w:r>
+    </w:p>
+    <w:p>
+      <w:pPr>
+        <w:pStyle w:val="Compact"/>
+        <w:numPr>
+          <w:ilvl w:val="0"/>
+          <w:numId w:val="1002"/>
+        </w:numPr>
+      </w:pPr>
+      <w:r>
+        <w:t xml:space="preserve">JSON tabanlı Python CLI uygulaması</w:t>
+      </w:r>
+    </w:p>
+    <w:p>
+      <w:pPr>
+        <w:pStyle w:val="Compact"/>
+        <w:numPr>
+          <w:ilvl w:val="0"/>
+          <w:numId w:val="1002"/>
+        </w:numPr>
+      </w:pPr>
+      <w:r>
+        <w:t xml:space="preserve">Excel dashboard, AutoCAD çizim ve Blender 3D oda</w:t>
+      </w:r>
+    </w:p>
+    <w:bookmarkEnd w:id="14"/>
+    <w:bookmarkStart w:id="15" w:name="projeler"/>
+    <w:p>
+      <w:pPr>
+        <w:pStyle w:val="Heading2"/>
+      </w:pPr>
+      <w:r>
+        <w:t xml:space="preserve">PROJELER</w:t>
+      </w:r>
+    </w:p>
+    <w:p>
+      <w:pPr>
+        <w:pStyle w:val="FirstParagraph"/>
+      </w:pPr>
+      <w:r>
+        <w:t xml:space="preserve">Adrenal Anomali Tespit Sistemi – Tez projesi</w:t>
+      </w:r>
+    </w:p>
+    <w:p>
+      <w:pPr>
+        <w:pStyle w:val="BodyText"/>
+      </w:pPr>
+      <w:r>
+        <w:t xml:space="preserve">Klinik karar destek için JWT’li NestJS + PostgreSQL backend ve React Native MRI/AI uygulaması. Özel, detaylar istek üzerine.</w:t>
+      </w:r>
+    </w:p>
+    <w:bookmarkEnd w:id="15"/>
+    <w:bookmarkStart w:id="16" w:name="eğitim"/>
+    <w:p>
+      <w:pPr>
+        <w:pStyle w:val="Heading2"/>
+      </w:pPr>
+      <w:r>
+        <w:t xml:space="preserve">EĞİTİM</w:t>
+      </w:r>
+    </w:p>
+    <w:p>
+      <w:pPr>
+        <w:pStyle w:val="FirstParagraph"/>
+      </w:pPr>
+      <w:r>
+        <w:t xml:space="preserve">Pamukkale Üniversitesi – Bilgisayar Mühendisliği Lisans</w:t>
+      </w:r>
+      <w:r>
+        <w:t xml:space="preserve">2022 – 2026 | GPA: 3.32</w:t>
+      </w:r>
+    </w:p>
+    <w:p>
+      <w:pPr>
+        <w:pStyle w:val="BodyText"/>
+      </w:pPr>
+      <w:r>
+        <w:t xml:space="preserve">Veri yapıları, algoritmalar, veritabanları, işletim sistemleri, yazılım mühendisliği, web teknolojileri, ağlar, makine öğrenmesi, yapay zeka, grafik, bulut bilişim.</w:t>
+      </w:r>
+    </w:p>
+    <w:p>
+      <w:pPr>
+        <w:pStyle w:val="BodyText"/>
+      </w:pPr>
+      <w:r>
+        <w:t xml:space="preserve">Maribor Üniversitesi – Erasmus</w:t>
+      </w:r>
+      <w:r>
+        <w:t xml:space="preserve">Şub – Tem 2025</w:t>
+      </w:r>
+    </w:p>
+    <w:p>
+      <w:pPr>
+        <w:pStyle w:val="BodyText"/>
+      </w:pPr>
+      <w:r>
+        <w:t xml:space="preserve">C++ ile OOP; Blender ile 3D animasyon ve grafik.</w:t>
+      </w:r>
+    </w:p>
+    <w:bookmarkEnd w:id="16"/>
+    <w:bookmarkStart w:id="17" w:name="yetenekler"/>
+    <w:p>
+      <w:pPr>
+        <w:pStyle w:val="Heading2"/>
+      </w:pPr>
+      <w:r>
+        <w:t xml:space="preserve">YETENEKLER</w:t>
+      </w:r>
+    </w:p>
+    <w:p>
+      <w:pPr>
+        <w:pStyle w:val="Compact"/>
+        <w:numPr>
+          <w:ilvl w:val="0"/>
+          <w:numId w:val="1003"/>
+        </w:numPr>
+      </w:pPr>
+      <w:r>
+        <w:t xml:space="preserve">Java, C#, TypeScript, SQL, HTML, CSS</w:t>
+      </w:r>
+    </w:p>
+    <w:p>
+      <w:pPr>
+        <w:pStyle w:val="Compact"/>
+        <w:numPr>
+          <w:ilvl w:val="0"/>
+          <w:numId w:val="1003"/>
+        </w:numPr>
+      </w:pPr>
+      <w:r>
+        <w:t xml:space="preserve">React, Next.js, React Native, NestJS, REST API, .NET Web API, MS SQL Server, PostgreSQL, Expo</w:t>
+      </w:r>
+    </w:p>
+    <w:p>
+      <w:pPr>
+        <w:pStyle w:val="Compact"/>
+        <w:numPr>
+          <w:ilvl w:val="0"/>
+          <w:numId w:val="1003"/>
+        </w:numPr>
+      </w:pPr>
+      <w:r>
         <w:t xml:space="preserve">Git/GitHub, Docker, Linux</w:t>
       </w:r>
     </w:p>
-    <w:bookmarkEnd w:id="13"/>
+    <w:bookmarkEnd w:id="17"/>
     <w:sectPr>
       <w:footnotePr>
         <w:numRestart w:val="eachSect"/>
@@ -429,6 +535,12 @@
     <w:abstractNumId w:val="990"/>
   </w:num>
   <w:num w:numId="1001">
+    <w:abstractNumId w:val="991"/>
+  </w:num>
+  <w:num w:numId="1002">
+    <w:abstractNumId w:val="991"/>
+  </w:num>
+  <w:num w:numId="1003">
     <w:abstractNumId w:val="991"/>
   </w:num>
 </w:numbering>

</xml_diff>

<commit_message>
feat: add Flutter and .NET skills, refresh CVs with FLAP internship
</commit_message>
<xml_diff>
--- a/public/cv/CV-minimal.docx
+++ b/public/cv/CV-minimal.docx
@@ -7,6 +7,9 @@
         <w:pStyle w:val="FirstParagraph"/>
       </w:pPr>
       <w:r>
+        <w:rPr>
+          <w:lang w:val="tr"/>
+        </w:rPr>
         <w:t xml:space="preserve">Muhammet Saraç</w:t>
       </w:r>
     </w:p>
@@ -15,6 +18,9 @@
         <w:pStyle w:val="BodyText"/>
       </w:pPr>
       <w:r>
+        <w:rPr>
+          <w:lang w:val="tr"/>
+        </w:rPr>
         <w:t xml:space="preserve">Bilgisayar Mühendisliği Öğrencisi</w:t>
       </w:r>
     </w:p>
@@ -26,65 +32,102 @@
         <w:r>
           <w:rPr>
             <w:rStyle w:val="Hyperlink"/>
+            <w:lang w:val="tr"/>
           </w:rPr>
           <w:t xml:space="preserve">Mtsarac03@gmail.com</w:t>
         </w:r>
       </w:hyperlink>
       <w:r>
+        <w:rPr>
+          <w:lang w:val="tr"/>
+        </w:rPr>
         <w:t xml:space="preserve"> </w:t>
       </w:r>
       <w:r>
+        <w:rPr>
+          <w:lang w:val="tr"/>
+        </w:rPr>
         <w:t xml:space="preserve"> |  (541) 614-8690  | </w:t>
       </w:r>
       <w:r>
+        <w:rPr>
+          <w:lang w:val="tr"/>
+        </w:rPr>
         <w:t xml:space="preserve"> </w:t>
       </w:r>
       <w:hyperlink r:id="rId10">
         <w:r>
           <w:rPr>
             <w:rStyle w:val="Hyperlink"/>
+            <w:lang w:val="tr"/>
           </w:rPr>
           <w:t xml:space="preserve">linkedin.com/in/mtsarac</w:t>
         </w:r>
       </w:hyperlink>
       <w:r>
+        <w:rPr>
+          <w:lang w:val="tr"/>
+        </w:rPr>
         <w:t xml:space="preserve"> </w:t>
       </w:r>
       <w:r>
+        <w:rPr>
+          <w:lang w:val="tr"/>
+        </w:rPr>
         <w:t xml:space="preserve"> | </w:t>
       </w:r>
       <w:r>
+        <w:rPr>
+          <w:lang w:val="tr"/>
+        </w:rPr>
         <w:t xml:space="preserve"> </w:t>
       </w:r>
       <w:hyperlink r:id="rId11">
         <w:r>
           <w:rPr>
             <w:rStyle w:val="Hyperlink"/>
+            <w:lang w:val="tr"/>
           </w:rPr>
           <w:t xml:space="preserve">Github.com/mtsarac</w:t>
         </w:r>
       </w:hyperlink>
       <w:r>
+        <w:rPr>
+          <w:lang w:val="tr"/>
+        </w:rPr>
         <w:t xml:space="preserve"> </w:t>
       </w:r>
       <w:r>
+        <w:rPr>
+          <w:lang w:val="tr"/>
+        </w:rPr>
         <w:t xml:space="preserve"> | </w:t>
       </w:r>
       <w:r>
+        <w:rPr>
+          <w:lang w:val="tr"/>
+        </w:rPr>
         <w:t xml:space="preserve"> </w:t>
       </w:r>
       <w:hyperlink r:id="rId12">
         <w:r>
           <w:rPr>
             <w:rStyle w:val="Hyperlink"/>
+            <w:lang w:val="tr"/>
           </w:rPr>
           <w:t xml:space="preserve">msarac.me</w:t>
         </w:r>
       </w:hyperlink>
       <w:r>
+        <w:rPr>
+          <w:lang w:val="tr"/>
+        </w:rPr>
         <w:t xml:space="preserve"> </w:t>
       </w:r>
       <w:r>
+        <w:rPr>
+          <w:lang w:val="tr"/>
+        </w:rPr>
         <w:t xml:space="preserve"> |  Merkezefendi/Denizli</w:t>
       </w:r>
     </w:p>
@@ -94,6 +137,9 @@
         <w:pStyle w:val="Heading2"/>
       </w:pPr>
       <w:r>
+        <w:rPr>
+          <w:lang w:val="tr"/>
+        </w:rPr>
         <w:t xml:space="preserve">PROFİL</w:t>
       </w:r>
     </w:p>
@@ -102,6 +148,9 @@
         <w:pStyle w:val="FirstParagraph"/>
       </w:pPr>
       <w:r>
+        <w:rPr>
+          <w:lang w:val="tr"/>
+        </w:rPr>
         <w:t xml:space="preserve">Pamukkale Üniversitesi son sınıf Bilgisayar Mühendisliği öğrencisiyim (GPA 3.32). NestJS, PostgreSQL ve React ile backend ağırlıklı full-stack geliştirmeye odaklanıyorum. Gerçek ürün çıkaracağım junior ve staj pozisyonları arıyorum.</w:t>
       </w:r>
     </w:p>
@@ -112,6 +161,9 @@
         <w:pStyle w:val="Heading2"/>
       </w:pPr>
       <w:r>
+        <w:rPr>
+          <w:lang w:val="tr"/>
+        </w:rPr>
         <w:t xml:space="preserve">DENEYİM</w:t>
       </w:r>
     </w:p>
@@ -120,9 +172,15 @@
         <w:pStyle w:val="FirstParagraph"/>
       </w:pPr>
       <w:r>
+        <w:rPr>
+          <w:lang w:val="tr"/>
+        </w:rPr>
         <w:t xml:space="preserve">ADM Elektrik Dağıtım – BT Stajyeri, Denizli</w:t>
       </w:r>
       <w:r>
+        <w:rPr>
+          <w:lang w:val="tr"/>
+        </w:rPr>
         <w:t xml:space="preserve">Tem – Ağu 2026</w:t>
       </w:r>
     </w:p>
@@ -135,6 +193,9 @@
         </w:numPr>
       </w:pPr>
       <w:r>
+        <w:rPr>
+          <w:lang w:val="tr"/>
+        </w:rPr>
         <w:t xml:space="preserve">BT envanter, stok ve zimmet takibi için PostgreSQL şeması</w:t>
       </w:r>
     </w:p>
@@ -147,6 +208,9 @@
         </w:numPr>
       </w:pPr>
       <w:r>
+        <w:rPr>
+          <w:lang w:val="tr"/>
+        </w:rPr>
         <w:t xml:space="preserve">İş gereksinimlerinden React + TypeScript CRM prototipi</w:t>
       </w:r>
     </w:p>
@@ -159,6 +223,9 @@
         </w:numPr>
       </w:pPr>
       <w:r>
+        <w:rPr>
+          <w:lang w:val="tr"/>
+        </w:rPr>
         <w:t xml:space="preserve">SAP, Jira ve Qlik süreçleri; MASSGuard AI konsepti</w:t>
       </w:r>
     </w:p>
@@ -167,10 +234,16 @@
         <w:pStyle w:val="FirstParagraph"/>
       </w:pPr>
       <w:r>
-        <w:t xml:space="preserve">TNC Group / Social Office – BT Stajyeri</w:t>
-      </w:r>
-      <w:r>
-        <w:t xml:space="preserve">2026</w:t>
+        <w:rPr>
+          <w:lang w:val="tr"/>
+        </w:rPr>
+        <w:t xml:space="preserve">FLAP Yazılım – Yazılım Stajyeri, Denizli</w:t>
+      </w:r>
+      <w:r>
+        <w:rPr>
+          <w:lang w:val="tr"/>
+        </w:rPr>
+        <w:t xml:space="preserve">Eyl – Eki 2026</w:t>
       </w:r>
     </w:p>
     <w:p>
@@ -182,7 +255,10 @@
         </w:numPr>
       </w:pPr>
       <w:r>
-        <w:t xml:space="preserve">JSON tabanlı Python CLI uygulaması</w:t>
+        <w:rPr>
+          <w:lang w:val="tr"/>
+        </w:rPr>
+        <w:t xml:space="preserve">SQL Server yedekleme platformu: çok kiracılı ASP.NET Core API, Quartz.NET, PostgreSQL, agent, React arayüzü</w:t>
       </w:r>
     </w:p>
     <w:p>
@@ -194,17 +270,40 @@
         </w:numPr>
       </w:pPr>
       <w:r>
-        <w:t xml:space="preserve">Excel dashboard, AutoCAD çizim ve Blender 3D oda</w:t>
-      </w:r>
-    </w:p>
-    <w:bookmarkEnd w:id="14"/>
-    <w:bookmarkStart w:id="15" w:name="projeler"/>
-    <w:p>
-      <w:pPr>
-        <w:pStyle w:val="Heading2"/>
-      </w:pPr>
-      <w:r>
-        <w:t xml:space="preserve">PROJELER</w:t>
+        <w:rPr>
+          <w:lang w:val="tr"/>
+        </w:rPr>
+        <w:t xml:space="preserve">Çevrimdışı öncelikli IMAP/SMTP mail istemcisi: .NET 10 + PostgreSQL backend, Flutter uygulaması</w:t>
+      </w:r>
+    </w:p>
+    <w:p>
+      <w:pPr>
+        <w:pStyle w:val="Compact"/>
+        <w:numPr>
+          <w:ilvl w:val="0"/>
+          <w:numId w:val="1002"/>
+        </w:numPr>
+      </w:pPr>
+      <w:r>
+        <w:rPr>
+          <w:lang w:val="tr"/>
+        </w:rPr>
+        <w:t xml:space="preserve">Firmanın mutabakat web uygulamasına küçük katkı (backend düzeltmeleri, erişilebilir arayüz)</w:t>
+      </w:r>
+    </w:p>
+    <w:p>
+      <w:pPr>
+        <w:pStyle w:val="Compact"/>
+        <w:numPr>
+          <w:ilvl w:val="0"/>
+          <w:numId w:val="1002"/>
+        </w:numPr>
+      </w:pPr>
+      <w:r>
+        <w:rPr>
+          <w:lang w:val="tr"/>
+        </w:rPr>
+        <w:t xml:space="preserve">Referans istenirse paylaşılabilir</w:t>
       </w:r>
     </w:p>
     <w:p>
@@ -212,73 +311,16 @@
         <w:pStyle w:val="FirstParagraph"/>
       </w:pPr>
       <w:r>
-        <w:t xml:space="preserve">Adrenal Anomali Tespit Sistemi – Tez projesi</w:t>
-      </w:r>
-    </w:p>
-    <w:p>
-      <w:pPr>
-        <w:pStyle w:val="BodyText"/>
-      </w:pPr>
-      <w:r>
-        <w:t xml:space="preserve">Klinik karar destek için JWT’li NestJS + PostgreSQL backend ve React Native MRI/AI uygulaması. Özel, detaylar istek üzerine.</w:t>
-      </w:r>
-    </w:p>
-    <w:bookmarkEnd w:id="15"/>
-    <w:bookmarkStart w:id="16" w:name="eğitim"/>
-    <w:p>
-      <w:pPr>
-        <w:pStyle w:val="Heading2"/>
-      </w:pPr>
-      <w:r>
-        <w:t xml:space="preserve">EĞİTİM</w:t>
-      </w:r>
-    </w:p>
-    <w:p>
-      <w:pPr>
-        <w:pStyle w:val="FirstParagraph"/>
-      </w:pPr>
-      <w:r>
-        <w:t xml:space="preserve">Pamukkale Üniversitesi – Bilgisayar Mühendisliği Lisans</w:t>
-      </w:r>
-      <w:r>
-        <w:t xml:space="preserve">2022 – 2026 | GPA: 3.32</w:t>
-      </w:r>
-    </w:p>
-    <w:p>
-      <w:pPr>
-        <w:pStyle w:val="BodyText"/>
-      </w:pPr>
-      <w:r>
-        <w:t xml:space="preserve">Veri yapıları, algoritmalar, veritabanları, işletim sistemleri, yazılım mühendisliği, web teknolojileri, ağlar, makine öğrenmesi, yapay zeka, grafik, bulut bilişim.</w:t>
-      </w:r>
-    </w:p>
-    <w:p>
-      <w:pPr>
-        <w:pStyle w:val="BodyText"/>
-      </w:pPr>
-      <w:r>
-        <w:t xml:space="preserve">Maribor Üniversitesi – Erasmus</w:t>
-      </w:r>
-      <w:r>
-        <w:t xml:space="preserve">Şub – Tem 2025</w:t>
-      </w:r>
-    </w:p>
-    <w:p>
-      <w:pPr>
-        <w:pStyle w:val="BodyText"/>
-      </w:pPr>
-      <w:r>
-        <w:t xml:space="preserve">C++ ile OOP; Blender ile 3D animasyon ve grafik.</w:t>
-      </w:r>
-    </w:p>
-    <w:bookmarkEnd w:id="16"/>
-    <w:bookmarkStart w:id="17" w:name="yetenekler"/>
-    <w:p>
-      <w:pPr>
-        <w:pStyle w:val="Heading2"/>
-      </w:pPr>
-      <w:r>
-        <w:t xml:space="preserve">YETENEKLER</w:t>
+        <w:rPr>
+          <w:lang w:val="tr"/>
+        </w:rPr>
+        <w:t xml:space="preserve">TNC Group / Social Office – BT Stajyeri</w:t>
+      </w:r>
+      <w:r>
+        <w:rPr>
+          <w:lang w:val="tr"/>
+        </w:rPr>
+        <w:t xml:space="preserve">2026</w:t>
       </w:r>
     </w:p>
     <w:p>
@@ -290,7 +332,10 @@
         </w:numPr>
       </w:pPr>
       <w:r>
-        <w:t xml:space="preserve">Java, C#, TypeScript, SQL, HTML, CSS</w:t>
+        <w:rPr>
+          <w:lang w:val="tr"/>
+        </w:rPr>
+        <w:t xml:space="preserve">JSON tabanlı Python CLI uygulaması</w:t>
       </w:r>
     </w:p>
     <w:p>
@@ -302,7 +347,171 @@
         </w:numPr>
       </w:pPr>
       <w:r>
-        <w:t xml:space="preserve">React, Next.js, React Native, NestJS, REST API, .NET Web API, MS SQL Server, PostgreSQL, Expo</w:t>
+        <w:rPr>
+          <w:lang w:val="tr"/>
+        </w:rPr>
+        <w:t xml:space="preserve">Excel dashboard, AutoCAD çizim ve Blender 3D oda</w:t>
+      </w:r>
+    </w:p>
+    <w:bookmarkEnd w:id="14"/>
+    <w:bookmarkStart w:id="15" w:name="projeler"/>
+    <w:p>
+      <w:pPr>
+        <w:pStyle w:val="Heading2"/>
+      </w:pPr>
+      <w:r>
+        <w:rPr>
+          <w:lang w:val="tr"/>
+        </w:rPr>
+        <w:t xml:space="preserve">PROJELER</w:t>
+      </w:r>
+    </w:p>
+    <w:p>
+      <w:pPr>
+        <w:pStyle w:val="FirstParagraph"/>
+      </w:pPr>
+      <w:r>
+        <w:rPr>
+          <w:lang w:val="tr"/>
+        </w:rPr>
+        <w:t xml:space="preserve">Adrenal Anomali Tespit Sistemi – Tez projesi</w:t>
+      </w:r>
+    </w:p>
+    <w:p>
+      <w:pPr>
+        <w:pStyle w:val="BodyText"/>
+      </w:pPr>
+      <w:r>
+        <w:rPr>
+          <w:lang w:val="tr"/>
+        </w:rPr>
+        <w:t xml:space="preserve">Klinik karar destek için JWT’li NestJS + PostgreSQL backend ve React Native MRI/AI uygulaması. Özel, detaylar istek üzerine.</w:t>
+      </w:r>
+    </w:p>
+    <w:p>
+      <w:pPr>
+        <w:pStyle w:val="BodyText"/>
+      </w:pPr>
+      <w:r>
+        <w:rPr>
+          <w:lang w:val="tr"/>
+        </w:rPr>
+        <w:t xml:space="preserve">Backup Platform – Staj projesi</w:t>
+      </w:r>
+    </w:p>
+    <w:p>
+      <w:pPr>
+        <w:pStyle w:val="BodyText"/>
+      </w:pPr>
+      <w:r>
+        <w:rPr>
+          <w:lang w:val="tr"/>
+        </w:rPr>
+        <w:t xml:space="preserve">ASP.NET Core + Quartz.NET + PostgreSQL backend, SQL Server yedekleme agent’ı ve React arayüzü. Açık kaynak: github.com/mtsarac/backup-platform.</w:t>
+      </w:r>
+    </w:p>
+    <w:p>
+      <w:pPr>
+        <w:pStyle w:val="BodyText"/>
+      </w:pPr>
+      <w:r>
+        <w:rPr>
+          <w:lang w:val="tr"/>
+        </w:rPr>
+        <w:t xml:space="preserve">Kaydetmail – Staj projesi</w:t>
+      </w:r>
+    </w:p>
+    <w:p>
+      <w:pPr>
+        <w:pStyle w:val="BodyText"/>
+      </w:pPr>
+      <w:r>
+        <w:rPr>
+          <w:lang w:val="tr"/>
+        </w:rPr>
+        <w:t xml:space="preserve">Çevrimdışı öncelikli çok hesaplı IMAP/SMTP istemcisi: .NET 10 + PostgreSQL backend ve Flutter uygulaması. Açık kaynak: github.com/mtsarac/mail-client.</w:t>
+      </w:r>
+    </w:p>
+    <w:bookmarkEnd w:id="15"/>
+    <w:bookmarkStart w:id="16" w:name="eğitim"/>
+    <w:p>
+      <w:pPr>
+        <w:pStyle w:val="Heading2"/>
+      </w:pPr>
+      <w:r>
+        <w:rPr>
+          <w:lang w:val="tr"/>
+        </w:rPr>
+        <w:t xml:space="preserve">EĞİTİM</w:t>
+      </w:r>
+    </w:p>
+    <w:p>
+      <w:pPr>
+        <w:pStyle w:val="FirstParagraph"/>
+      </w:pPr>
+      <w:r>
+        <w:rPr>
+          <w:lang w:val="tr"/>
+        </w:rPr>
+        <w:t xml:space="preserve">Pamukkale Üniversitesi – Bilgisayar Mühendisliği Lisans</w:t>
+      </w:r>
+      <w:r>
+        <w:rPr>
+          <w:lang w:val="tr"/>
+        </w:rPr>
+        <w:t xml:space="preserve">2022 – 2026 | GPA: 3.32</w:t>
+      </w:r>
+    </w:p>
+    <w:p>
+      <w:pPr>
+        <w:pStyle w:val="BodyText"/>
+      </w:pPr>
+      <w:r>
+        <w:rPr>
+          <w:lang w:val="tr"/>
+        </w:rPr>
+        <w:t xml:space="preserve">Veri yapıları, algoritmalar, veritabanları, işletim sistemleri, yazılım mühendisliği, web teknolojileri, ağlar, makine öğrenmesi, yapay zeka, grafik, bulut bilişim.</w:t>
+      </w:r>
+    </w:p>
+    <w:p>
+      <w:pPr>
+        <w:pStyle w:val="BodyText"/>
+      </w:pPr>
+      <w:r>
+        <w:rPr>
+          <w:lang w:val="tr"/>
+        </w:rPr>
+        <w:t xml:space="preserve">Maribor Üniversitesi – Erasmus</w:t>
+      </w:r>
+      <w:r>
+        <w:rPr>
+          <w:lang w:val="tr"/>
+        </w:rPr>
+        <w:t xml:space="preserve">Şub – Tem 2025</w:t>
+      </w:r>
+    </w:p>
+    <w:p>
+      <w:pPr>
+        <w:pStyle w:val="BodyText"/>
+      </w:pPr>
+      <w:r>
+        <w:rPr>
+          <w:lang w:val="tr"/>
+        </w:rPr>
+        <w:t xml:space="preserve">C++ ile OOP; Blender ile 3D animasyon ve grafik.</w:t>
+      </w:r>
+    </w:p>
+    <w:bookmarkEnd w:id="16"/>
+    <w:bookmarkStart w:id="17" w:name="yetenekler"/>
+    <w:p>
+      <w:pPr>
+        <w:pStyle w:val="Heading2"/>
+      </w:pPr>
+      <w:r>
+        <w:rPr>
+          <w:lang w:val="tr"/>
+        </w:rPr>
+        <w:t xml:space="preserve">YETENEKLER</w:t>
       </w:r>
     </w:p>
     <w:p>
@@ -310,10 +519,43 @@
         <w:pStyle w:val="Compact"/>
         <w:numPr>
           <w:ilvl w:val="0"/>
-          <w:numId w:val="1003"/>
+          <w:numId w:val="1004"/>
         </w:numPr>
       </w:pPr>
       <w:r>
+        <w:rPr>
+          <w:lang w:val="tr"/>
+        </w:rPr>
+        <w:t xml:space="preserve">Java, C#, TypeScript, SQL, HTML, CSS</w:t>
+      </w:r>
+    </w:p>
+    <w:p>
+      <w:pPr>
+        <w:pStyle w:val="Compact"/>
+        <w:numPr>
+          <w:ilvl w:val="0"/>
+          <w:numId w:val="1004"/>
+        </w:numPr>
+      </w:pPr>
+      <w:r>
+        <w:rPr>
+          <w:lang w:val="tr"/>
+        </w:rPr>
+        <w:t xml:space="preserve">React, Next.js, React Native, Flutter, NestJS, REST API, .NET, .NET Web API, MS SQL Server, PostgreSQL, Expo</w:t>
+      </w:r>
+    </w:p>
+    <w:p>
+      <w:pPr>
+        <w:pStyle w:val="Compact"/>
+        <w:numPr>
+          <w:ilvl w:val="0"/>
+          <w:numId w:val="1004"/>
+        </w:numPr>
+      </w:pPr>
+      <w:r>
+        <w:rPr>
+          <w:lang w:val="tr"/>
+        </w:rPr>
         <w:t xml:space="preserve">Git/GitHub, Docker, Linux</w:t>
       </w:r>
     </w:p>
@@ -541,6 +783,9 @@
     <w:abstractNumId w:val="991"/>
   </w:num>
   <w:num w:numId="1003">
+    <w:abstractNumId w:val="991"/>
+  </w:num>
+  <w:num w:numId="1004">
     <w:abstractNumId w:val="991"/>
   </w:num>
 </w:numbering>

</xml_diff>

<commit_message>
feat: bullet-point education sections in CVs
</commit_message>
<xml_diff>
--- a/public/cv/CV-minimal.docx
+++ b/public/cv/CV-minimal.docx
@@ -464,58 +464,6 @@
     </w:p>
     <w:p>
       <w:pPr>
-        <w:pStyle w:val="BodyText"/>
-      </w:pPr>
-      <w:r>
-        <w:rPr>
-          <w:lang w:val="tr"/>
-        </w:rPr>
-        <w:t xml:space="preserve">Veri yapıları, algoritmalar, veritabanları, işletim sistemleri, yazılım mühendisliği, web teknolojileri, ağlar, makine öğrenmesi, yapay zeka, grafik, bulut bilişim.</w:t>
-      </w:r>
-    </w:p>
-    <w:p>
-      <w:pPr>
-        <w:pStyle w:val="BodyText"/>
-      </w:pPr>
-      <w:r>
-        <w:rPr>
-          <w:lang w:val="tr"/>
-        </w:rPr>
-        <w:t xml:space="preserve">Maribor Üniversitesi – Erasmus</w:t>
-      </w:r>
-      <w:r>
-        <w:rPr>
-          <w:lang w:val="tr"/>
-        </w:rPr>
-        <w:t xml:space="preserve">Şub – Tem 2025</w:t>
-      </w:r>
-    </w:p>
-    <w:p>
-      <w:pPr>
-        <w:pStyle w:val="BodyText"/>
-      </w:pPr>
-      <w:r>
-        <w:rPr>
-          <w:lang w:val="tr"/>
-        </w:rPr>
-        <w:t xml:space="preserve">C++ ile OOP; Blender ile 3D animasyon ve grafik.</w:t>
-      </w:r>
-    </w:p>
-    <w:bookmarkEnd w:id="16"/>
-    <w:bookmarkStart w:id="17" w:name="yetenekler"/>
-    <w:p>
-      <w:pPr>
-        <w:pStyle w:val="Heading2"/>
-      </w:pPr>
-      <w:r>
-        <w:rPr>
-          <w:lang w:val="tr"/>
-        </w:rPr>
-        <w:t xml:space="preserve">YETENEKLER</w:t>
-      </w:r>
-    </w:p>
-    <w:p>
-      <w:pPr>
         <w:pStyle w:val="Compact"/>
         <w:numPr>
           <w:ilvl w:val="0"/>
@@ -526,7 +474,7 @@
         <w:rPr>
           <w:lang w:val="tr"/>
         </w:rPr>
-        <w:t xml:space="preserve">Java, C#, TypeScript, SQL, HTML, CSS</w:t>
+        <w:t xml:space="preserve">Veri yapıları, algoritmalar, veritabanları, işletim sistemleri</w:t>
       </w:r>
     </w:p>
     <w:p>
@@ -541,7 +489,7 @@
         <w:rPr>
           <w:lang w:val="tr"/>
         </w:rPr>
-        <w:t xml:space="preserve">React, Next.js, React Native, Flutter, NestJS, REST API, .NET, .NET Web API, MS SQL Server, PostgreSQL, Expo</w:t>
+        <w:t xml:space="preserve">Yazılım mühendisliği, web teknolojileri, bilgisayar ağları</w:t>
       </w:r>
     </w:p>
     <w:p>
@@ -550,6 +498,111 @@
         <w:numPr>
           <w:ilvl w:val="0"/>
           <w:numId w:val="1004"/>
+        </w:numPr>
+      </w:pPr>
+      <w:r>
+        <w:rPr>
+          <w:lang w:val="tr"/>
+        </w:rPr>
+        <w:t xml:space="preserve">Makine öğrenmesi, yapay zeka, grafik, bulut bilişim</w:t>
+      </w:r>
+    </w:p>
+    <w:p>
+      <w:pPr>
+        <w:pStyle w:val="FirstParagraph"/>
+      </w:pPr>
+      <w:r>
+        <w:rPr>
+          <w:lang w:val="tr"/>
+        </w:rPr>
+        <w:t xml:space="preserve">Maribor Üniversitesi – Erasmus</w:t>
+      </w:r>
+      <w:r>
+        <w:rPr>
+          <w:lang w:val="tr"/>
+        </w:rPr>
+        <w:t xml:space="preserve">Şub – Tem 2025</w:t>
+      </w:r>
+    </w:p>
+    <w:p>
+      <w:pPr>
+        <w:pStyle w:val="Compact"/>
+        <w:numPr>
+          <w:ilvl w:val="0"/>
+          <w:numId w:val="1005"/>
+        </w:numPr>
+      </w:pPr>
+      <w:r>
+        <w:rPr>
+          <w:lang w:val="tr"/>
+        </w:rPr>
+        <w:t xml:space="preserve">Erasmus değişim programı, C++ ile OOP</w:t>
+      </w:r>
+    </w:p>
+    <w:p>
+      <w:pPr>
+        <w:pStyle w:val="Compact"/>
+        <w:numPr>
+          <w:ilvl w:val="0"/>
+          <w:numId w:val="1005"/>
+        </w:numPr>
+      </w:pPr>
+      <w:r>
+        <w:rPr>
+          <w:lang w:val="tr"/>
+        </w:rPr>
+        <w:t xml:space="preserve">Blender ile 3D animasyon ve grafik</w:t>
+      </w:r>
+    </w:p>
+    <w:bookmarkEnd w:id="16"/>
+    <w:bookmarkStart w:id="17" w:name="yetenekler"/>
+    <w:p>
+      <w:pPr>
+        <w:pStyle w:val="Heading2"/>
+      </w:pPr>
+      <w:r>
+        <w:rPr>
+          <w:lang w:val="tr"/>
+        </w:rPr>
+        <w:t xml:space="preserve">YETENEKLER</w:t>
+      </w:r>
+    </w:p>
+    <w:p>
+      <w:pPr>
+        <w:pStyle w:val="Compact"/>
+        <w:numPr>
+          <w:ilvl w:val="0"/>
+          <w:numId w:val="1006"/>
+        </w:numPr>
+      </w:pPr>
+      <w:r>
+        <w:rPr>
+          <w:lang w:val="tr"/>
+        </w:rPr>
+        <w:t xml:space="preserve">Java, C#, TypeScript, SQL, HTML, CSS</w:t>
+      </w:r>
+    </w:p>
+    <w:p>
+      <w:pPr>
+        <w:pStyle w:val="Compact"/>
+        <w:numPr>
+          <w:ilvl w:val="0"/>
+          <w:numId w:val="1006"/>
+        </w:numPr>
+      </w:pPr>
+      <w:r>
+        <w:rPr>
+          <w:lang w:val="tr"/>
+        </w:rPr>
+        <w:t xml:space="preserve">React, Next.js, React Native, Flutter, NestJS, REST API, .NET, .NET Web API, MS SQL Server, PostgreSQL, Expo</w:t>
+      </w:r>
+    </w:p>
+    <w:p>
+      <w:pPr>
+        <w:pStyle w:val="Compact"/>
+        <w:numPr>
+          <w:ilvl w:val="0"/>
+          <w:numId w:val="1006"/>
         </w:numPr>
       </w:pPr>
       <w:r>
@@ -786,6 +839,12 @@
     <w:abstractNumId w:val="991"/>
   </w:num>
   <w:num w:numId="1004">
+    <w:abstractNumId w:val="991"/>
+  </w:num>
+  <w:num w:numId="1005">
+    <w:abstractNumId w:val="991"/>
+  </w:num>
+  <w:num w:numId="1006">
     <w:abstractNumId w:val="991"/>
   </w:num>
 </w:numbering>

</xml_diff>